<commit_message>
docs: viertes Dokument 'Geplante Aenderungen - Digitaler Omnibus'
Ausblick auf das, was noch aussteht - getrennt nach geltendem Recht und Vorhaben:

- ausstehende delegierte Rechtsakte, Leitlinien und Muster der KI-VO mit Fristen
- die jaehrliche Pruefung von Anhang III und der Verbotsliste nach Art. 112 Abs. 1
- die noch offene Digital-Omnibus-Verordnung zu DSGVO, Data Act, ePrivacy und NIS-2
  (COM(2025) 837, Rat ohne Position am 29.07.2026), mit den fuenf Punkten, die
  KI-Anwender unmittelbar beruehren
- Beobachtungsliste mit zwoelf Punkten

Ausdruecklicher Hinweis im Dokument: Es beschreibt Vorhaben, keine geltende
Rechtslage. Bis zur Veroeffentlichung im Amtsblatt gilt das bestehende Recht.
</commit_message>
<xml_diff>
--- a/01_EU-AI-Act_Verstaendlich_Beschreibung.docx
+++ b/01_EU-AI-Act_Verstaendlich_Beschreibung.docx
@@ -55,7 +55,7 @@
           <w:bCs/>
           <w:b/>
         </w:rPr>
-        <w:t xml:space="preserve">Rechtsstand: 29.07.2026 · Fassung 1.1</w:t>
+        <w:t xml:space="preserve">Rechtsstand: 29.07.2026 · Fassung 1.2</w:t>
       </w:r>
       <w:r>
         <w:t xml:space="preserve"> </w:t>
@@ -5017,6 +5017,21 @@
       </w:r>
       <w:r>
         <w:t xml:space="preserve">Checklisten Anbieter und Betreiber</w:t>
+      </w:r>
+      <w:r>
+        <w:t xml:space="preserve">”</w:t>
+      </w:r>
+      <w:r>
+        <w:t xml:space="preserve">. Was an diesen Pflichten noch nicht endgültig feststeht — ausstehende delegierte Rechtsakte, Leitlinien und Muster —, steht im Begleitdokument</w:t>
+      </w:r>
+      <w:r>
+        <w:t xml:space="preserve"> </w:t>
+      </w:r>
+      <w:r>
+        <w:t xml:space="preserve">“</w:t>
+      </w:r>
+      <w:r>
+        <w:t xml:space="preserve">Geplante Änderungen — Digitaler Omnibus</w:t>
       </w:r>
       <w:r>
         <w:t xml:space="preserve">”</w:t>
@@ -10258,6 +10273,85 @@
       </w:r>
     </w:p>
     <w:p>
+      <w:pPr>
+        <w:pStyle w:val="BodyText"/>
+      </w:pPr>
+      <w:r>
+        <w:rPr>
+          <w:bCs/>
+          <w:b/>
+        </w:rPr>
+        <w:t xml:space="preserve">Schritt 6 — Beobachten, was noch kommt.</w:t>
+      </w:r>
+      <w:r>
+        <w:t xml:space="preserve"> </w:t>
+      </w:r>
+      <w:r>
+        <w:t xml:space="preserve">Mehrere Punkte der Verordnung sind bewusst offen gelassen: delegierte Rechtsakte, Leitlinien und Muster stehen noch aus, und die Kommission prüft</w:t>
+      </w:r>
+      <w:r>
+        <w:t xml:space="preserve"> </w:t>
+      </w:r>
+      <w:r>
+        <w:rPr>
+          <w:bCs/>
+          <w:b/>
+        </w:rPr>
+        <w:t xml:space="preserve">jährlich</w:t>
+      </w:r>
+      <w:r>
+        <w:t xml:space="preserve">, ob Anhang III und die Verbotsliste zu ändern sind. Parallel läuft die zweite Hälfte des Digital Omnibus — die Datenverordnung mit Änderungen an DSGVO, Data Act und ePrivacy — noch im Gesetzgebungsverfahren. Das Begleitdokument</w:t>
+      </w:r>
+      <w:r>
+        <w:t xml:space="preserve"> </w:t>
+      </w:r>
+      <w:r>
+        <w:rPr>
+          <w:bCs/>
+          <w:b/>
+        </w:rPr>
+        <w:t xml:space="preserve">“</w:t>
+      </w:r>
+      <w:r>
+        <w:rPr>
+          <w:bCs/>
+          <w:b/>
+        </w:rPr>
+        <w:t xml:space="preserve">Geplante Änderungen — Digitaler Omnibus</w:t>
+      </w:r>
+      <w:r>
+        <w:rPr>
+          <w:bCs/>
+          <w:b/>
+        </w:rPr>
+        <w:t xml:space="preserve">”</w:t>
+      </w:r>
+      <w:r>
+        <w:t xml:space="preserve"> </w:t>
+      </w:r>
+      <w:r>
+        <w:t xml:space="preserve">führt beides mit Fristen und einer Beobachtungsliste zusammen.</w:t>
+      </w:r>
+    </w:p>
+    <w:p>
+      <w:pPr>
+        <w:pStyle w:val="BlockText"/>
+      </w:pPr>
+      <w:r>
+        <w:rPr>
+          <w:bCs/>
+          <w:b/>
+        </w:rPr>
+        <w:t xml:space="preserve">Fundstelle:</w:t>
+      </w:r>
+      <w:r>
+        <w:t xml:space="preserve"> </w:t>
+      </w:r>
+      <w:r>
+        <w:t xml:space="preserve">Art. 112 Abs. 1 KI-VO (jährliche Prüfung von Anhang III und Art. 5); Art. 2 Abs. 13 KI-VO n. F. (delegierte Rechtsakte bis 02.08.2027).</w:t>
+      </w:r>
+    </w:p>
+    <w:p>
       <w:r>
         <w:pict>
           <v:rect style="width:0;height:1.5pt" o:hralign="center" o:hrstd="t" o:hr="t"/>
@@ -10520,7 +10614,7 @@
           <w:iCs/>
           <w:i/>
         </w:rPr>
-        <w:t xml:space="preserve">Fassung 1.1 · Erstellt am 29.07.2026 · Rechtsstand: 29.07.2026</w:t>
+        <w:t xml:space="preserve">Fassung 1.2 · Erstellt am 29.07.2026 · Rechtsstand: 29.07.2026</w:t>
       </w:r>
       <w:r>
         <w:t xml:space="preserve"> </w:t>

</xml_diff>